<commit_message>
edit rancangan TA part 2
</commit_message>
<xml_diff>
--- a/Rancangan_TA_Smart_Lamp_Grandy.docx
+++ b/Rancangan_TA_Smart_Lamp_Grandy.docx
@@ -2931,6 +2931,8 @@
       <w:r>
         <w:t xml:space="preserve"> Utama</w:t>
       </w:r>
+      <w:bookmarkStart w:id="0" w:name="_GoBack"/>
+      <w:bookmarkEnd w:id="0"/>
     </w:p>
     <w:p>
       <w:pPr>
@@ -3128,7 +3130,7 @@
           </w:tcPr>
           <w:p>
             <w:r>
-              <w:t>username</w:t>
+              <w:t>name</w:t>
             </w:r>
           </w:p>
         </w:tc>
@@ -3146,7 +3148,7 @@
             </w:r>
             <w:proofErr w:type="gramEnd"/>
             <w:r>
-              <w:t>50) UNIQUE NOT NULL</w:t>
+              <w:t>50) NOT NULL</w:t>
             </w:r>
           </w:p>
         </w:tc>
@@ -3163,20 +3165,17 @@
             </w:r>
             <w:proofErr w:type="spellStart"/>
             <w:r>
+              <w:t>asli</w:t>
+            </w:r>
+            <w:proofErr w:type="spellEnd"/>
+            <w:r>
+              <w:t xml:space="preserve"> </w:t>
+            </w:r>
+            <w:proofErr w:type="spellStart"/>
+            <w:r>
               <w:t>pengguna</w:t>
             </w:r>
             <w:proofErr w:type="spellEnd"/>
-            <w:r>
-              <w:t xml:space="preserve"> </w:t>
-            </w:r>
-            <w:proofErr w:type="spellStart"/>
-            <w:r>
-              <w:t>untuk</w:t>
-            </w:r>
-            <w:proofErr w:type="spellEnd"/>
-            <w:r>
-              <w:t xml:space="preserve"> login</w:t>
-            </w:r>
           </w:p>
         </w:tc>
       </w:tr>
@@ -3192,11 +3191,9 @@
             <w:tcW w:w="0" w:type="auto"/>
           </w:tcPr>
           <w:p>
-            <w:proofErr w:type="spellStart"/>
-            <w:r>
-              <w:t>password_hash</w:t>
-            </w:r>
-            <w:proofErr w:type="spellEnd"/>
+            <w:r>
+              <w:t>username</w:t>
+            </w:r>
           </w:p>
         </w:tc>
         <w:tc>
@@ -3213,7 +3210,7 @@
             </w:r>
             <w:proofErr w:type="gramEnd"/>
             <w:r>
-              <w:t>255) NOT NULL</w:t>
+              <w:t>50) UNIQUE NOT NULL</w:t>
             </w:r>
           </w:p>
         </w:tc>
@@ -3226,23 +3223,23 @@
               <w:cnfStyle w:val="000000100000" w:firstRow="0" w:lastRow="0" w:firstColumn="0" w:lastColumn="0" w:oddVBand="0" w:evenVBand="0" w:oddHBand="1" w:evenHBand="0" w:firstRowFirstColumn="0" w:firstRowLastColumn="0" w:lastRowFirstColumn="0" w:lastRowLastColumn="0"/>
             </w:pPr>
             <w:r>
-              <w:t xml:space="preserve">Password yang </w:t>
+              <w:t xml:space="preserve">Nama </w:t>
             </w:r>
             <w:proofErr w:type="spellStart"/>
             <w:r>
-              <w:t>sudah</w:t>
+              <w:t>pengguna</w:t>
             </w:r>
             <w:proofErr w:type="spellEnd"/>
             <w:r>
-              <w:t xml:space="preserve"> di-hash (</w:t>
+              <w:t xml:space="preserve"> </w:t>
             </w:r>
             <w:proofErr w:type="spellStart"/>
             <w:r>
-              <w:t>bcrypt</w:t>
+              <w:t>untuk</w:t>
             </w:r>
             <w:proofErr w:type="spellEnd"/>
             <w:r>
-              <w:t>/SHA-256)</w:t>
+              <w:t xml:space="preserve"> login</w:t>
             </w:r>
           </w:p>
         </w:tc>
@@ -3259,9 +3256,11 @@
             <w:tcW w:w="0" w:type="auto"/>
           </w:tcPr>
           <w:p>
-            <w:r>
-              <w:t>role</w:t>
-            </w:r>
+            <w:proofErr w:type="spellStart"/>
+            <w:r>
+              <w:t>password_hash</w:t>
+            </w:r>
+            <w:proofErr w:type="spellEnd"/>
           </w:p>
         </w:tc>
         <w:tc>
@@ -3274,11 +3273,11 @@
             </w:pPr>
             <w:proofErr w:type="gramStart"/>
             <w:r>
-              <w:t>ENUM(</w:t>
+              <w:t>VARCHAR(</w:t>
             </w:r>
             <w:proofErr w:type="gramEnd"/>
             <w:r>
-              <w:t>'admin', 'user', 'guest')</w:t>
+              <w:t>255) NOT NULL</w:t>
             </w:r>
           </w:p>
         </w:tc>
@@ -3290,19 +3289,25 @@
             <w:pPr>
               <w:cnfStyle w:val="000000010000" w:firstRow="0" w:lastRow="0" w:firstColumn="0" w:lastColumn="0" w:oddVBand="0" w:evenVBand="0" w:oddHBand="0" w:evenHBand="1" w:firstRowFirstColumn="0" w:firstRowLastColumn="0" w:lastRowFirstColumn="0" w:lastRowLastColumn="0"/>
             </w:pPr>
+            <w:r>
+              <w:t xml:space="preserve">Password yang </w:t>
+            </w:r>
             <w:proofErr w:type="spellStart"/>
             <w:r>
-              <w:t>Peran</w:t>
+              <w:t>sudah</w:t>
             </w:r>
             <w:proofErr w:type="spellEnd"/>
             <w:r>
-              <w:t xml:space="preserve"> </w:t>
+              <w:t xml:space="preserve"> di-hash (</w:t>
             </w:r>
             <w:proofErr w:type="spellStart"/>
             <w:r>
-              <w:t>pengguna</w:t>
+              <w:t>bcrypt</w:t>
             </w:r>
             <w:proofErr w:type="spellEnd"/>
+            <w:r>
+              <w:t>/SHA-256)</w:t>
+            </w:r>
           </w:p>
         </w:tc>
       </w:tr>
@@ -3318,11 +3323,9 @@
             <w:tcW w:w="0" w:type="auto"/>
           </w:tcPr>
           <w:p>
-            <w:proofErr w:type="spellStart"/>
-            <w:r>
-              <w:t>created_at</w:t>
-            </w:r>
-            <w:proofErr w:type="spellEnd"/>
+            <w:r>
+              <w:t>role</w:t>
+            </w:r>
           </w:p>
         </w:tc>
         <w:tc>
@@ -3333,8 +3336,13 @@
             <w:pPr>
               <w:cnfStyle w:val="000000100000" w:firstRow="0" w:lastRow="0" w:firstColumn="0" w:lastColumn="0" w:oddVBand="0" w:evenVBand="0" w:oddHBand="1" w:evenHBand="0" w:firstRowFirstColumn="0" w:firstRowLastColumn="0" w:lastRowFirstColumn="0" w:lastRowLastColumn="0"/>
             </w:pPr>
-            <w:r>
-              <w:t>TIMESTAMP DEFAULT CURRENT_TIMESTAMP</w:t>
+            <w:proofErr w:type="gramStart"/>
+            <w:r>
+              <w:t>ENUM(</w:t>
+            </w:r>
+            <w:proofErr w:type="gramEnd"/>
+            <w:r>
+              <w:t>'admin', 'user', 'guest')</w:t>
             </w:r>
           </w:p>
         </w:tc>
@@ -3345,6 +3353,62 @@
           <w:p>
             <w:pPr>
               <w:cnfStyle w:val="000000100000" w:firstRow="0" w:lastRow="0" w:firstColumn="0" w:lastColumn="0" w:oddVBand="0" w:evenVBand="0" w:oddHBand="1" w:evenHBand="0" w:firstRowFirstColumn="0" w:firstRowLastColumn="0" w:lastRowFirstColumn="0" w:lastRowLastColumn="0"/>
+            </w:pPr>
+            <w:proofErr w:type="spellStart"/>
+            <w:r>
+              <w:t>Peran</w:t>
+            </w:r>
+            <w:proofErr w:type="spellEnd"/>
+            <w:r>
+              <w:t xml:space="preserve"> </w:t>
+            </w:r>
+            <w:proofErr w:type="spellStart"/>
+            <w:r>
+              <w:t>pengguna</w:t>
+            </w:r>
+            <w:proofErr w:type="spellEnd"/>
+          </w:p>
+        </w:tc>
+      </w:tr>
+      <w:tr>
+        <w:trPr>
+          <w:cnfStyle w:val="000000010000" w:firstRow="0" w:lastRow="0" w:firstColumn="0" w:lastColumn="0" w:oddVBand="0" w:evenVBand="0" w:oddHBand="0" w:evenHBand="1" w:firstRowFirstColumn="0" w:firstRowLastColumn="0" w:lastRowFirstColumn="0" w:lastRowLastColumn="0"/>
+          <w:trHeight w:val="506"/>
+          <w:jc w:val="center"/>
+        </w:trPr>
+        <w:tc>
+          <w:tcPr>
+            <w:cnfStyle w:val="001000000000" w:firstRow="0" w:lastRow="0" w:firstColumn="1" w:lastColumn="0" w:oddVBand="0" w:evenVBand="0" w:oddHBand="0" w:evenHBand="0" w:firstRowFirstColumn="0" w:firstRowLastColumn="0" w:lastRowFirstColumn="0" w:lastRowLastColumn="0"/>
+            <w:tcW w:w="0" w:type="auto"/>
+          </w:tcPr>
+          <w:p>
+            <w:proofErr w:type="spellStart"/>
+            <w:r>
+              <w:t>created_at</w:t>
+            </w:r>
+            <w:proofErr w:type="spellEnd"/>
+          </w:p>
+        </w:tc>
+        <w:tc>
+          <w:tcPr>
+            <w:tcW w:w="0" w:type="auto"/>
+          </w:tcPr>
+          <w:p>
+            <w:pPr>
+              <w:cnfStyle w:val="000000010000" w:firstRow="0" w:lastRow="0" w:firstColumn="0" w:lastColumn="0" w:oddVBand="0" w:evenVBand="0" w:oddHBand="0" w:evenHBand="1" w:firstRowFirstColumn="0" w:firstRowLastColumn="0" w:lastRowFirstColumn="0" w:lastRowLastColumn="0"/>
+            </w:pPr>
+            <w:r>
+              <w:t>TIMESTAMP DEFAULT CURRENT_TIMESTAMP</w:t>
+            </w:r>
+          </w:p>
+        </w:tc>
+        <w:tc>
+          <w:tcPr>
+            <w:tcW w:w="0" w:type="auto"/>
+          </w:tcPr>
+          <w:p>
+            <w:pPr>
+              <w:cnfStyle w:val="000000010000" w:firstRow="0" w:lastRow="0" w:firstColumn="0" w:lastColumn="0" w:oddVBand="0" w:evenVBand="0" w:oddHBand="0" w:evenHBand="1" w:firstRowFirstColumn="0" w:firstRowLastColumn="0" w:lastRowFirstColumn="0" w:lastRowLastColumn="0"/>
             </w:pPr>
             <w:r>
               <w:t xml:space="preserve">Waktu </w:t>
@@ -3372,6 +3436,7 @@
         <w:pStyle w:val="Heading3"/>
       </w:pPr>
       <w:r>
+        <w:lastRenderedPageBreak/>
         <w:t xml:space="preserve">B. </w:t>
       </w:r>
       <w:proofErr w:type="spellStart"/>
@@ -3459,7 +3524,6 @@
           </w:tcPr>
           <w:p>
             <w:r>
-              <w:lastRenderedPageBreak/>
               <w:t>Field</w:t>
             </w:r>
           </w:p>
@@ -4578,6 +4642,7 @@
           <w:p>
             <w:proofErr w:type="spellStart"/>
             <w:r>
+              <w:lastRenderedPageBreak/>
               <w:t>threshold_on</w:t>
             </w:r>
             <w:proofErr w:type="spellEnd"/>
@@ -4728,7 +4793,6 @@
           <w:p>
             <w:proofErr w:type="spellStart"/>
             <w:r>
-              <w:lastRenderedPageBreak/>
               <w:t>system_mode</w:t>
             </w:r>
             <w:proofErr w:type="spellEnd"/>
@@ -5770,6 +5834,7 @@
           <w:p>
             <w:proofErr w:type="spellStart"/>
             <w:r>
+              <w:lastRenderedPageBreak/>
               <w:t>lamp_id</w:t>
             </w:r>
             <w:proofErr w:type="spellEnd"/>
@@ -5897,7 +5962,6 @@
           <w:p>
             <w:proofErr w:type="spellStart"/>
             <w:r>
-              <w:lastRenderedPageBreak/>
               <w:t>hours_used</w:t>
             </w:r>
             <w:proofErr w:type="spellEnd"/>
@@ -6160,7 +6224,7 @@
           </w14:textOutline>
         </w:rPr>
         <w:drawing>
-          <wp:anchor distT="0" distB="0" distL="114300" distR="114300" simplePos="0" relativeHeight="251651072" behindDoc="0" locked="0" layoutInCell="1" allowOverlap="1" wp14:anchorId="65DD6689" wp14:editId="45B04726">
+          <wp:anchor distT="0" distB="0" distL="114300" distR="114300" simplePos="0" relativeHeight="251651072" behindDoc="0" locked="0" layoutInCell="1" allowOverlap="1" wp14:anchorId="65DD6689" wp14:editId="5D88544D">
             <wp:simplePos x="0" y="0"/>
             <wp:positionH relativeFrom="column">
               <wp:posOffset>-90805</wp:posOffset>
@@ -6251,14 +6315,13 @@
           </w14:textOutline>
         </w:rPr>
       </w:pPr>
-      <w:bookmarkStart w:id="0" w:name="_GoBack"/>
-      <w:bookmarkEnd w:id="0"/>
     </w:p>
     <w:p>
       <w:pPr>
         <w:pStyle w:val="Heading1"/>
       </w:pPr>
       <w:r>
+        <w:lastRenderedPageBreak/>
         <w:t>4. RELASI ANTAR TABEL</w:t>
       </w:r>
     </w:p>
@@ -6373,7 +6436,6 @@
         <w:pStyle w:val="Heading2"/>
       </w:pPr>
       <w:r>
-        <w:lastRenderedPageBreak/>
         <w:t xml:space="preserve">4.1 Diagram </w:t>
       </w:r>
       <w:proofErr w:type="spellStart"/>
@@ -7820,7 +7882,11 @@
       </w:r>
       <w:proofErr w:type="spellEnd"/>
       <w:r>
-        <w:t xml:space="preserve"> global </w:t>
+        <w:t xml:space="preserve"> </w:t>
+      </w:r>
+      <w:r>
+        <w:lastRenderedPageBreak/>
+        <w:t xml:space="preserve">global </w:t>
       </w:r>
       <w:proofErr w:type="spellStart"/>
       <w:r>
@@ -7981,7 +8047,6 @@
         <w:pStyle w:val="Heading2"/>
       </w:pPr>
       <w:r>
-        <w:lastRenderedPageBreak/>
         <w:t xml:space="preserve">4.2 </w:t>
       </w:r>
       <w:proofErr w:type="spellStart"/>
@@ -9162,6 +9227,7 @@
               <w:jc w:val="center"/>
             </w:pPr>
             <w:r>
+              <w:lastRenderedPageBreak/>
               <w:t>4</w:t>
             </w:r>
           </w:p>
@@ -9339,7 +9405,6 @@
               <w:jc w:val="center"/>
             </w:pPr>
             <w:r>
-              <w:lastRenderedPageBreak/>
               <w:t>6</w:t>
             </w:r>
           </w:p>
@@ -10719,6 +10784,7 @@
         <w:pStyle w:val="Heading2"/>
       </w:pPr>
       <w:r>
+        <w:lastRenderedPageBreak/>
         <w:t xml:space="preserve">5.2 </w:t>
       </w:r>
       <w:proofErr w:type="spellStart"/>
@@ -10827,7 +10893,6 @@
       </w:pPr>
       <w:proofErr w:type="spellStart"/>
       <w:r>
-        <w:lastRenderedPageBreak/>
         <w:t>Manajemen</w:t>
       </w:r>
       <w:proofErr w:type="spellEnd"/>
@@ -11765,6 +11830,7 @@
       </w:pPr>
       <w:proofErr w:type="spellStart"/>
       <w:r>
+        <w:lastRenderedPageBreak/>
         <w:t>Cocok</w:t>
       </w:r>
       <w:proofErr w:type="spellEnd"/>
@@ -11866,7 +11932,6 @@
         <w:pStyle w:val="Heading1"/>
       </w:pPr>
       <w:r>
-        <w:lastRenderedPageBreak/>
         <w:t>6. KESIMPULAN</w:t>
       </w:r>
     </w:p>
@@ -24861,7 +24926,7 @@
 </file>
 
 <file path=customXml/itemProps1.xml><?xml version="1.0" encoding="utf-8"?>
-<ds:datastoreItem xmlns:ds="http://schemas.openxmlformats.org/officeDocument/2006/customXml" ds:itemID="{6D6B08E7-184A-4C3F-8E6C-8347597C67B5}">
+<ds:datastoreItem xmlns:ds="http://schemas.openxmlformats.org/officeDocument/2006/customXml" ds:itemID="{BAFAF40F-AD0E-4A7A-A140-230014E1EFF4}">
   <ds:schemaRefs>
     <ds:schemaRef ds:uri="http://schemas.openxmlformats.org/officeDocument/2006/bibliography"/>
   </ds:schemaRefs>

</xml_diff>